<commit_message>
已把 TAS2O_School_Course_Calendar_Addendum_AI_Enhanced.docx 补到和 OSR/OST / OSSLT / community involvement 同一口径。
</commit_message>
<xml_diff>
--- a/05_School_Admin_and_Inspection/TAS2O_School_Course_Calendar_Addendum_AI_Enhanced.docx
+++ b/05_School_Admin_and_Inspection/TAS2O_School_Course_Calendar_Addendum_AI_Enhanced.docx
@@ -269,7 +269,7 @@
     </w:p>
     <w:p>
       <w:r>
-        <w:t>This addendum is intended to be inserted into, or attached to, the school course calendar for the academic year in which TAS2O is offered as an Ontario Secondary School Diploma (OSSD) credit course. It provides course offering information, course description, assessment summary, learning format, student expectations, AI-use guidelines, safety requirements, and pathway connections.</w:t>
+        <w:t>This addendum is intended to be inserted into, or attached to, the school course calendar for the academic year in which TAS2O is offered as an Ontario Secondary School Diploma (OSSD) credit course. It provides course offering information, course description, assessment summary, learning format, student expectations, AI-use guidelines, safety requirements, and pathway connections. It should be reviewed together with school record procedures when the school calendar is finalized.</w:t>
       </w:r>
     </w:p>
     <w:p>
@@ -2984,17 +2984,16 @@
       </w:r>
     </w:p>
     <w:p>
+      <w:r>
+        <w:t>The school course calendar should also point readers to the OSR/OST procedure, OSSLT / OSSLC procedure, and community involvement 40-hour log process used by the school.</w:t>
+      </w:r>
+    </w:p>
+    <w:p>
       <w:pPr>
         <w:ind w:left="432" w:right="432"/>
       </w:pPr>
       <w:r>
-        <w:rPr>
-          <w:b/>
-        </w:rPr>
-        <w:t xml:space="preserve">TAS2O - Technology and the Skilled Trades, Grade 10, Open, 1 Credit. </w:t>
-      </w:r>
-      <w:r>
-        <w:t>This open course allows students to explore technological education and skilled trades through practical, project-based learning. Students learn to identify problems, plan and design solutions, use tools and digital technologies safely, create prototypes, test and refine designs, and communicate their results. Course activities may include safety training, measurement and quality control, material comparison, CAD or digital design, rapid prototyping, basic electronics or automation, sustainability analysis, and skilled-trades career pathway research. AI tools are used as learning supports for brainstorming, explanation, drafting, debugging, feedback, and documentation, but students must verify all AI-generated information and maintain an AI Use Log where required. The final evaluation includes a capstone prototype/product/service, portfolio, and presentation/demo. Prerequisite: None.</w:t>
+        <w:t>TAS2O - Technology and the Skilled Trades, Grade 10, Open, 1 Credit. This open course allows students to explore technological education and skilled trades through practical, project-based learning. Students learn to identify problems, plan and design solutions, use tools and digital technologies safely, create prototypes, test and refine designs, and communicate their results. Course activities may include safety training, measurement and quality control, material comparison, CAD or digital design, rapid prototyping, basic electronics or automation, sustainability analysis, and skilled-trades career pathway research. AI tools are used as learning supports for brainstorming, explanation, drafting, debugging, feedback, and documentation, but students must verify all AI-generated information and maintain an AI Use Log where required. The final evaluation includes a capstone prototype/product/service, portfolio, and presentation/demo. Prerequisite: None. The school calendar and administrative package should also cross-reference the OSR/OST procedure, OSSLT / OSSLC procedure, and community involvement 40-hour process so student records and graduation-related support are handled consistently.</w:t>
       </w:r>
     </w:p>
     <w:p>
@@ -3392,6 +3391,28 @@
           </w:p>
         </w:tc>
       </w:tr>
+      <w:tr>
+        <w:tc>
+          <w:tcPr>
+            <w:tcW w:type="dxa" w:w="5040"/>
+          </w:tcPr>
+          <w:p>
+            <w:r>
+              <w:t>OSR/OST, OSSLT, and community involvement procedures are cross-referenced in the school calendar and admin binder.</w:t>
+            </w:r>
+          </w:p>
+        </w:tc>
+        <w:tc>
+          <w:tcPr>
+            <w:tcW w:type="dxa" w:w="5040"/>
+          </w:tcPr>
+          <w:p>
+            <w:r>
+              <w:t>Pending</w:t>
+            </w:r>
+          </w:p>
+        </w:tc>
+      </w:tr>
     </w:tbl>
     <w:p/>
     <w:p>
@@ -3404,7 +3425,22 @@
     </w:p>
     <w:p>
       <w:r>
-        <w:t>Schools should insert or cross-reference their own policies below before finalizing this addendum:</w:t>
+        <w:t>Schools should insert or cross-reference their own policies below before finalizing this addendum, including the school procedures that apply to TAS2O:</w:t>
+      </w:r>
+    </w:p>
+    <w:p>
+      <w:r>
+        <w:t>OSR/OST procedure</w:t>
+      </w:r>
+    </w:p>
+    <w:p>
+      <w:r>
+        <w:t>OSSLT / OSSLC procedure</w:t>
+      </w:r>
+    </w:p>
+    <w:p>
+      <w:r>
+        <w:t>community involvement 40-hour procedure</w:t>
       </w:r>
     </w:p>
     <w:p>
@@ -3841,6 +3877,10 @@
         <w:t>End of TAS2O School Course Calendar Addendum.</w:t>
       </w:r>
     </w:p>
+    <w:p/>
+    <w:p/>
+    <w:p/>
+    <w:p/>
     <w:sectPr>
       <w:pgSz w:w="12240" w:h="15840"/>
       <w:pgMar w:top="1008" w:right="1080" w:bottom="1008" w:left="1080" w:header="720" w:footer="720" w:gutter="0"/>

</xml_diff>